<commit_message>
shifted vulnerability section from disk to troubleshoot
</commit_message>
<xml_diff>
--- a/Main_Prep_Doc/Prepration/Azure Managed Disk.docx
+++ b/Main_Prep_Doc/Prepration/Azure Managed Disk.docx
@@ -787,147 +787,6 @@
       </w:r>
     </w:p>
     <w:p/>
-    <w:p>
-      <w:pPr>
-        <w:pStyle w:val="Heading1"/>
-      </w:pPr>
-      <w:proofErr w:type="gramStart"/>
-      <w:r>
-        <w:t>VURNEBALITEIS:-</w:t>
-      </w:r>
-      <w:proofErr w:type="gramEnd"/>
-      <w:r>
-        <w:t xml:space="preserve"> </w:t>
-      </w:r>
-    </w:p>
-    <w:p/>
-    <w:p>
-      <w:r>
-        <w:rPr>
-          <w:noProof/>
-        </w:rPr>
-        <w:drawing>
-          <wp:inline distT="0" distB="0" distL="0" distR="0" wp14:anchorId="00F30D0C" wp14:editId="07482582">
-            <wp:extent cx="4762745" cy="4311872"/>
-            <wp:effectExtent l="0" t="0" r="0" b="0"/>
-            <wp:docPr id="266807539" name="Picture 1"/>
-            <wp:cNvGraphicFramePr>
-              <a:graphicFrameLocks xmlns:a="http://schemas.openxmlformats.org/drawingml/2006/main" noChangeAspect="1"/>
-            </wp:cNvGraphicFramePr>
-            <a:graphic xmlns:a="http://schemas.openxmlformats.org/drawingml/2006/main">
-              <a:graphicData uri="http://schemas.openxmlformats.org/drawingml/2006/picture">
-                <pic:pic xmlns:pic="http://schemas.openxmlformats.org/drawingml/2006/picture">
-                  <pic:nvPicPr>
-                    <pic:cNvPr id="266807539" name=""/>
-                    <pic:cNvPicPr/>
-                  </pic:nvPicPr>
-                  <pic:blipFill>
-                    <a:blip r:embed="rId8"/>
-                    <a:stretch>
-                      <a:fillRect/>
-                    </a:stretch>
-                  </pic:blipFill>
-                  <pic:spPr>
-                    <a:xfrm>
-                      <a:off x="0" y="0"/>
-                      <a:ext cx="4762745" cy="4311872"/>
-                    </a:xfrm>
-                    <a:prstGeom prst="rect">
-                      <a:avLst/>
-                    </a:prstGeom>
-                  </pic:spPr>
-                </pic:pic>
-              </a:graphicData>
-            </a:graphic>
-          </wp:inline>
-        </w:drawing>
-      </w:r>
-    </w:p>
-    <w:p>
-      <w:r>
-        <w:rPr>
-          <w:noProof/>
-        </w:rPr>
-        <w:lastRenderedPageBreak/>
-        <w:drawing>
-          <wp:inline distT="0" distB="0" distL="0" distR="0" wp14:anchorId="55BFAF56" wp14:editId="35B666DC">
-            <wp:extent cx="4229317" cy="3873699"/>
-            <wp:effectExtent l="0" t="0" r="0" b="0"/>
-            <wp:docPr id="1855181451" name="Picture 1"/>
-            <wp:cNvGraphicFramePr>
-              <a:graphicFrameLocks xmlns:a="http://schemas.openxmlformats.org/drawingml/2006/main" noChangeAspect="1"/>
-            </wp:cNvGraphicFramePr>
-            <a:graphic xmlns:a="http://schemas.openxmlformats.org/drawingml/2006/main">
-              <a:graphicData uri="http://schemas.openxmlformats.org/drawingml/2006/picture">
-                <pic:pic xmlns:pic="http://schemas.openxmlformats.org/drawingml/2006/picture">
-                  <pic:nvPicPr>
-                    <pic:cNvPr id="1855181451" name=""/>
-                    <pic:cNvPicPr/>
-                  </pic:nvPicPr>
-                  <pic:blipFill>
-                    <a:blip r:embed="rId9"/>
-                    <a:stretch>
-                      <a:fillRect/>
-                    </a:stretch>
-                  </pic:blipFill>
-                  <pic:spPr>
-                    <a:xfrm>
-                      <a:off x="0" y="0"/>
-                      <a:ext cx="4229317" cy="3873699"/>
-                    </a:xfrm>
-                    <a:prstGeom prst="rect">
-                      <a:avLst/>
-                    </a:prstGeom>
-                  </pic:spPr>
-                </pic:pic>
-              </a:graphicData>
-            </a:graphic>
-          </wp:inline>
-        </w:drawing>
-      </w:r>
-    </w:p>
-    <w:p>
-      <w:r>
-        <w:rPr>
-          <w:noProof/>
-        </w:rPr>
-        <w:drawing>
-          <wp:inline distT="0" distB="0" distL="0" distR="0" wp14:anchorId="73BFABE0" wp14:editId="1B3198C1">
-            <wp:extent cx="4711942" cy="4121362"/>
-            <wp:effectExtent l="0" t="0" r="0" b="0"/>
-            <wp:docPr id="2122520662" name="Picture 1"/>
-            <wp:cNvGraphicFramePr>
-              <a:graphicFrameLocks xmlns:a="http://schemas.openxmlformats.org/drawingml/2006/main" noChangeAspect="1"/>
-            </wp:cNvGraphicFramePr>
-            <a:graphic xmlns:a="http://schemas.openxmlformats.org/drawingml/2006/main">
-              <a:graphicData uri="http://schemas.openxmlformats.org/drawingml/2006/picture">
-                <pic:pic xmlns:pic="http://schemas.openxmlformats.org/drawingml/2006/picture">
-                  <pic:nvPicPr>
-                    <pic:cNvPr id="2122520662" name=""/>
-                    <pic:cNvPicPr/>
-                  </pic:nvPicPr>
-                  <pic:blipFill>
-                    <a:blip r:embed="rId10"/>
-                    <a:stretch>
-                      <a:fillRect/>
-                    </a:stretch>
-                  </pic:blipFill>
-                  <pic:spPr>
-                    <a:xfrm>
-                      <a:off x="0" y="0"/>
-                      <a:ext cx="4711942" cy="4121362"/>
-                    </a:xfrm>
-                    <a:prstGeom prst="rect">
-                      <a:avLst/>
-                    </a:prstGeom>
-                  </pic:spPr>
-                </pic:pic>
-              </a:graphicData>
-            </a:graphic>
-          </wp:inline>
-        </w:drawing>
-      </w:r>
-    </w:p>
     <w:sectPr>
       <w:pgSz w:w="11906" w:h="16838"/>
       <w:pgMar w:top="1440" w:right="1440" w:bottom="1440" w:left="1440" w:header="708" w:footer="708" w:gutter="0"/>

</xml_diff>